<commit_message>
Atualizações do Díário de Bordo
</commit_message>
<xml_diff>
--- a/Diário de bordo/Diário De Bordo (Oficial).docx
+++ b/Diário de bordo/Diário De Bordo (Oficial).docx
@@ -95,14 +95,7 @@
           <w:sz w:val="24"/>
           <w:szCs w:val="24"/>
         </w:rPr>
-        <w:t>Ocorreu a primeira aula sobre o Trabalho de Conclusão de Curso (TCC). O professor apresentou</w:t>
-      </w:r>
-      <w:r>
-        <w:rPr>
-          <w:sz w:val="24"/>
-          <w:szCs w:val="24"/>
-        </w:rPr>
-        <w:t xml:space="preserve"> orientações gerais sobre a preparação do projeto, fazendo uma breve explicação sobre sua estrutura, objetivos e importância. </w:t>
+        <w:t xml:space="preserve">Ocorreu a primeira aula sobre o Trabalho de Conclusão de Curso (TCC). O professor apresentou orientações gerais sobre a preparação do projeto, fazendo uma breve explicação sobre sua estrutura, objetivos e importância. </w:t>
       </w:r>
     </w:p>
     <w:p>
@@ -139,14 +132,7 @@
           <w:sz w:val="24"/>
           <w:szCs w:val="24"/>
         </w:rPr>
-        <w:t>, com a orientação do professor, percebemos</w:t>
-      </w:r>
-      <w:r>
-        <w:rPr>
-          <w:sz w:val="24"/>
-          <w:szCs w:val="24"/>
-        </w:rPr>
-        <w:t xml:space="preserve"> que talvez tenhamos sido precipitados demais, pois pulamos etapas importantes para definir um tema coerente com uma problemática social que justificasse o projeto.</w:t>
+        <w:t>, com a orientação do professor, percebemos que talvez tenhamos sido precipitados demais, pois pulamos etapas importantes para definir um tema coerente com uma problemática social que justificasse o projeto.</w:t>
       </w:r>
     </w:p>
     <w:p>
@@ -182,14 +168,7 @@
           <w:sz w:val="24"/>
           <w:szCs w:val="24"/>
         </w:rPr>
-        <w:t>Decidimos realizar pesquisas mais específicas acerca do tema, focando em</w:t>
-      </w:r>
-      <w:r>
-        <w:rPr>
-          <w:sz w:val="24"/>
-          <w:szCs w:val="24"/>
-        </w:rPr>
-        <w:t xml:space="preserve"> explorar as Plantas Alimentícias Não Convencionais (</w:t>
+        <w:t>Decidimos realizar pesquisas mais específicas acerca do tema, focando em explorar as Plantas Alimentícias Não Convencionais (</w:t>
       </w:r>
       <w:proofErr w:type="spellStart"/>
       <w:r>
@@ -330,51 +309,30 @@
           <w:sz w:val="24"/>
           <w:szCs w:val="24"/>
         </w:rPr>
-        <w:t>O professor o</w:t>
-      </w:r>
-      <w:r>
-        <w:rPr>
-          <w:sz w:val="24"/>
-          <w:szCs w:val="24"/>
-        </w:rPr>
-        <w:t>rientou buscarmos um artigo para leitura e análise. A atividade consistiu em identificar o objetivo geral, os objetivos específicos, a metodologia utilizada e a conclusão. Por fim, escrever uma breve síntese sobre o artigo.</w:t>
-      </w:r>
-    </w:p>
-    <w:p>
-      <w:pPr>
-        <w:rPr>
-          <w:sz w:val="24"/>
-          <w:szCs w:val="24"/>
-        </w:rPr>
-      </w:pPr>
-    </w:p>
-    <w:p>
-      <w:pPr>
-        <w:rPr>
-          <w:sz w:val="24"/>
-          <w:szCs w:val="24"/>
-        </w:rPr>
-      </w:pPr>
-      <w:r>
-        <w:rPr>
-          <w:sz w:val="24"/>
-          <w:szCs w:val="24"/>
-        </w:rPr>
-        <w:t xml:space="preserve">Em grupo, discutimos as ideias </w:t>
-      </w:r>
-      <w:r>
-        <w:rPr>
-          <w:sz w:val="24"/>
-          <w:szCs w:val="24"/>
-        </w:rPr>
-        <w:t>das pesquisas que tínhamos combinado fazer e levantamos problemáticas com base no que encontramos. Apresentamos algumas dessas ideias aos orientadores, que nos ajudaram a compreender melhor o que tínhamos que fazer para começar a planejar o projeto de form</w:t>
-      </w:r>
-      <w:r>
-        <w:rPr>
-          <w:sz w:val="24"/>
-          <w:szCs w:val="24"/>
-        </w:rPr>
-        <w:t xml:space="preserve">a coerente. </w:t>
+        <w:t>O professor orientou buscarmos um artigo para leitura e análise. A atividade consistiu em identificar o objetivo geral, os objetivos específicos, a metodologia utilizada e a conclusão. Por fim, escrever uma breve síntese sobre o artigo.</w:t>
+      </w:r>
+    </w:p>
+    <w:p>
+      <w:pPr>
+        <w:rPr>
+          <w:sz w:val="24"/>
+          <w:szCs w:val="24"/>
+        </w:rPr>
+      </w:pPr>
+    </w:p>
+    <w:p>
+      <w:pPr>
+        <w:rPr>
+          <w:sz w:val="24"/>
+          <w:szCs w:val="24"/>
+        </w:rPr>
+      </w:pPr>
+      <w:r>
+        <w:rPr>
+          <w:sz w:val="24"/>
+          <w:szCs w:val="24"/>
+        </w:rPr>
+        <w:t xml:space="preserve">Em grupo, discutimos as ideias das pesquisas que tínhamos combinado fazer e levantamos problemáticas com base no que encontramos. Apresentamos algumas dessas ideias aos orientadores, que nos ajudaram a compreender melhor o que tínhamos que fazer para começar a planejar o projeto de forma coerente. </w:t>
       </w:r>
     </w:p>
     <w:p>
@@ -451,35 +409,22 @@
           <w:rStyle w:val="Forte"/>
         </w:rPr>
         <w:lastRenderedPageBreak/>
-        <w:t>Decis</w:t>
-      </w:r>
-      <w:r>
-        <w:rPr>
-          <w:rStyle w:val="Forte"/>
-        </w:rPr>
-        <w:t xml:space="preserve">ões tomadas: </w:t>
-      </w:r>
-    </w:p>
-    <w:p>
-      <w:pPr>
-        <w:rPr>
-          <w:sz w:val="24"/>
-          <w:szCs w:val="24"/>
-        </w:rPr>
-      </w:pPr>
-      <w:r>
-        <w:rPr>
-          <w:sz w:val="24"/>
-          <w:szCs w:val="24"/>
-        </w:rPr>
-        <w:t>Decidimos estru</w:t>
-      </w:r>
-      <w:r>
-        <w:rPr>
-          <w:sz w:val="24"/>
-          <w:szCs w:val="24"/>
-        </w:rPr>
-        <w:t xml:space="preserve">turar melhor o planejamento do projeto com base nas orientações recebidas. </w:t>
+        <w:t xml:space="preserve">Decisões tomadas: </w:t>
+      </w:r>
+    </w:p>
+    <w:p>
+      <w:pPr>
+        <w:rPr>
+          <w:sz w:val="24"/>
+          <w:szCs w:val="24"/>
+        </w:rPr>
+      </w:pPr>
+      <w:r>
+        <w:rPr>
+          <w:sz w:val="24"/>
+          <w:szCs w:val="24"/>
+        </w:rPr>
+        <w:t xml:space="preserve">Decidimos estruturar melhor o planejamento do projeto com base nas orientações recebidas. </w:t>
       </w:r>
     </w:p>
     <w:p>
@@ -564,26 +509,184 @@
           <w:sz w:val="24"/>
           <w:szCs w:val="24"/>
         </w:rPr>
-        <w:t xml:space="preserve">DATA: </w:t>
-      </w:r>
-      <w:r>
+        <w:t>DATA: 26/02/2026</w:t>
+      </w:r>
+    </w:p>
+    <w:p>
+      <w:pPr>
         <w:rPr>
           <w:b/>
           <w:bCs/>
           <w:sz w:val="24"/>
           <w:szCs w:val="24"/>
         </w:rPr>
-        <w:t>26</w:t>
-      </w:r>
-      <w:r>
+      </w:pPr>
+    </w:p>
+    <w:p>
+      <w:pPr>
+        <w:rPr>
+          <w:rStyle w:val="Forte"/>
+        </w:rPr>
+      </w:pPr>
+      <w:r>
+        <w:rPr>
+          <w:rStyle w:val="Forte"/>
+        </w:rPr>
+        <w:t xml:space="preserve">Atividades realizadas: </w:t>
+      </w:r>
+    </w:p>
+    <w:p>
+      <w:pPr>
+        <w:rPr>
+          <w:sz w:val="24"/>
+          <w:szCs w:val="24"/>
+        </w:rPr>
+      </w:pPr>
+      <w:r>
+        <w:rPr>
+          <w:sz w:val="24"/>
+          <w:szCs w:val="24"/>
+        </w:rPr>
+        <w:t>Finalizamos</w:t>
+      </w:r>
+      <w:r>
+        <w:rPr>
+          <w:sz w:val="24"/>
+          <w:szCs w:val="24"/>
+        </w:rPr>
+        <w:t xml:space="preserve"> a atividade dos artigos proposta pelo professor,</w:t>
+      </w:r>
+      <w:r>
+        <w:rPr>
+          <w:sz w:val="24"/>
+          <w:szCs w:val="24"/>
+        </w:rPr>
+        <w:t xml:space="preserve"> concluindo a leitura, análise e a síntese.</w:t>
+      </w:r>
+      <w:r>
+        <w:rPr>
+          <w:sz w:val="24"/>
+          <w:szCs w:val="24"/>
+        </w:rPr>
+        <w:t xml:space="preserve">  </w:t>
+      </w:r>
+    </w:p>
+    <w:p>
+      <w:pPr>
+        <w:rPr>
+          <w:sz w:val="24"/>
+          <w:szCs w:val="24"/>
+        </w:rPr>
+      </w:pPr>
+      <w:r>
+        <w:rPr>
+          <w:sz w:val="24"/>
+          <w:szCs w:val="24"/>
+        </w:rPr>
+        <w:t xml:space="preserve"> </w:t>
+      </w:r>
+    </w:p>
+    <w:p>
+      <w:pPr>
         <w:rPr>
           <w:b/>
           <w:bCs/>
-          <w:sz w:val="24"/>
-          <w:szCs w:val="24"/>
-        </w:rPr>
-        <w:t>/02/2026</w:t>
-      </w:r>
+        </w:rPr>
+      </w:pPr>
+      <w:r>
+        <w:rPr>
+          <w:rStyle w:val="Forte"/>
+        </w:rPr>
+        <w:t>Decisões tomadas:</w:t>
+      </w:r>
+      <w:r>
+        <w:rPr>
+          <w:sz w:val="24"/>
+          <w:szCs w:val="24"/>
+        </w:rPr>
+        <w:t xml:space="preserve"> </w:t>
+      </w:r>
+    </w:p>
+    <w:p>
+      <w:pPr>
+        <w:rPr>
+          <w:sz w:val="24"/>
+          <w:szCs w:val="24"/>
+        </w:rPr>
+      </w:pPr>
+      <w:r>
+        <w:rPr>
+          <w:sz w:val="24"/>
+          <w:szCs w:val="24"/>
+        </w:rPr>
+        <w:t>Decidimos que, com base nos artigos usados, estudar melhor suas estruturas seria importante para viabilizar o nosso projeto.</w:t>
+      </w:r>
+    </w:p>
+    <w:p>
+      <w:pPr>
+        <w:rPr>
+          <w:sz w:val="24"/>
+          <w:szCs w:val="24"/>
+        </w:rPr>
+      </w:pPr>
+    </w:p>
+    <w:p>
+      <w:pPr>
+        <w:rPr>
+          <w:rStyle w:val="Forte"/>
+        </w:rPr>
+      </w:pPr>
+      <w:r>
+        <w:rPr>
+          <w:rStyle w:val="Forte"/>
+        </w:rPr>
+        <w:t xml:space="preserve">Próximos passos: </w:t>
+      </w:r>
+    </w:p>
+    <w:p>
+      <w:pPr>
+        <w:rPr>
+          <w:sz w:val="24"/>
+          <w:szCs w:val="24"/>
+        </w:rPr>
+      </w:pPr>
+      <w:r>
+        <w:rPr>
+          <w:sz w:val="24"/>
+          <w:szCs w:val="24"/>
+        </w:rPr>
+        <w:t xml:space="preserve">Nas próximas aulas, apresentar </w:t>
+      </w:r>
+      <w:r>
+        <w:rPr>
+          <w:sz w:val="24"/>
+          <w:szCs w:val="24"/>
+        </w:rPr>
+        <w:t>certas</w:t>
+      </w:r>
+      <w:r>
+        <w:rPr>
+          <w:sz w:val="24"/>
+          <w:szCs w:val="24"/>
+        </w:rPr>
+        <w:t xml:space="preserve"> ideias ao professor orientador para, assim, prosseguir na articulação do nosso TCC.</w:t>
+      </w:r>
+    </w:p>
+    <w:p>
+      <w:pPr>
+        <w:rPr>
+          <w:sz w:val="24"/>
+          <w:szCs w:val="24"/>
+        </w:rPr>
+      </w:pPr>
+    </w:p>
+    <w:p>
+      <w:pPr>
+        <w:rPr>
+          <w:sz w:val="24"/>
+          <w:szCs w:val="24"/>
+        </w:rPr>
+      </w:pPr>
     </w:p>
     <w:p>
       <w:pPr>
@@ -594,150 +697,278 @@
           <w:szCs w:val="24"/>
         </w:rPr>
       </w:pPr>
-    </w:p>
-    <w:p>
-      <w:pPr>
-        <w:rPr>
-          <w:rStyle w:val="Forte"/>
-        </w:rPr>
-      </w:pPr>
-      <w:r>
-        <w:rPr>
-          <w:rStyle w:val="Forte"/>
-        </w:rPr>
-        <w:t xml:space="preserve">Atividades realizadas: </w:t>
-      </w:r>
-    </w:p>
-    <w:p>
-      <w:pPr>
-        <w:rPr>
-          <w:sz w:val="24"/>
-          <w:szCs w:val="24"/>
-        </w:rPr>
-      </w:pPr>
-      <w:r>
-        <w:rPr>
-          <w:sz w:val="24"/>
-          <w:szCs w:val="24"/>
-        </w:rPr>
-        <w:t>Finalizamos</w:t>
-      </w:r>
-      <w:r>
-        <w:rPr>
-          <w:sz w:val="24"/>
-          <w:szCs w:val="24"/>
-        </w:rPr>
-        <w:t xml:space="preserve"> a atividade dos artigos proposta pelo professor,</w:t>
-      </w:r>
-      <w:r>
-        <w:rPr>
-          <w:sz w:val="24"/>
-          <w:szCs w:val="24"/>
-        </w:rPr>
-        <w:t xml:space="preserve"> concluindo a leitura, análise e a síntese.</w:t>
-      </w:r>
-      <w:r>
-        <w:rPr>
-          <w:sz w:val="24"/>
-          <w:szCs w:val="24"/>
-        </w:rPr>
-        <w:t xml:space="preserve">  </w:t>
-      </w:r>
-    </w:p>
-    <w:p>
-      <w:pPr>
-        <w:rPr>
-          <w:sz w:val="24"/>
-          <w:szCs w:val="24"/>
-        </w:rPr>
-      </w:pPr>
-      <w:r>
-        <w:rPr>
-          <w:sz w:val="24"/>
-          <w:szCs w:val="24"/>
-        </w:rPr>
-        <w:t xml:space="preserve"> </w:t>
-      </w:r>
-    </w:p>
-    <w:p>
-      <w:pPr>
+      <w:r>
         <w:rPr>
           <w:b/>
           <w:bCs/>
-        </w:rPr>
-      </w:pPr>
-      <w:r>
-        <w:rPr>
-          <w:rStyle w:val="Forte"/>
-        </w:rPr>
-        <w:t>Decisões tomadas:</w:t>
-      </w:r>
-      <w:r>
-        <w:rPr>
-          <w:sz w:val="24"/>
-          <w:szCs w:val="24"/>
-        </w:rPr>
+          <w:sz w:val="24"/>
+          <w:szCs w:val="24"/>
+        </w:rPr>
+        <w:t>DATA: 05/03/2026</w:t>
+      </w:r>
+    </w:p>
+    <w:p>
+      <w:pPr>
+        <w:rPr>
+          <w:sz w:val="24"/>
+          <w:szCs w:val="24"/>
+        </w:rPr>
+      </w:pPr>
+    </w:p>
+    <w:p>
+      <w:pPr>
+        <w:rPr>
+          <w:rStyle w:val="Forte"/>
+        </w:rPr>
+      </w:pPr>
+      <w:r>
+        <w:rPr>
+          <w:rStyle w:val="Forte"/>
+        </w:rPr>
+        <w:t xml:space="preserve">Atividades realizadas: </w:t>
+      </w:r>
+    </w:p>
+    <w:p>
+      <w:pPr>
+        <w:rPr>
+          <w:sz w:val="24"/>
+          <w:szCs w:val="24"/>
+        </w:rPr>
+      </w:pPr>
+      <w:r>
+        <w:rPr>
+          <w:sz w:val="24"/>
+          <w:szCs w:val="24"/>
+        </w:rPr>
+        <w:t xml:space="preserve">Após recebermos um retorno positivo do professor orientador sobre o possível tema do nosso projeto, decidimos dividir o grupo para que cada integrante </w:t>
+      </w:r>
+      <w:r>
+        <w:rPr>
+          <w:sz w:val="24"/>
+          <w:szCs w:val="24"/>
+        </w:rPr>
+        <w:t xml:space="preserve">pudesse </w:t>
+      </w:r>
+      <w:r>
+        <w:rPr>
+          <w:sz w:val="24"/>
+          <w:szCs w:val="24"/>
+        </w:rPr>
+        <w:t>foca</w:t>
+      </w:r>
+      <w:r>
+        <w:rPr>
+          <w:sz w:val="24"/>
+          <w:szCs w:val="24"/>
+        </w:rPr>
+        <w:t>r</w:t>
+      </w:r>
+      <w:r>
+        <w:rPr>
+          <w:sz w:val="24"/>
+          <w:szCs w:val="24"/>
+        </w:rPr>
+        <w:t xml:space="preserve"> em </w:t>
+      </w:r>
+      <w:r>
+        <w:rPr>
+          <w:sz w:val="24"/>
+          <w:szCs w:val="24"/>
+        </w:rPr>
+        <w:t>uma tarefa</w:t>
+      </w:r>
+      <w:r>
+        <w:rPr>
+          <w:sz w:val="24"/>
+          <w:szCs w:val="24"/>
+        </w:rPr>
+        <w:t xml:space="preserve"> espec</w:t>
+      </w:r>
+      <w:r>
+        <w:rPr>
+          <w:sz w:val="24"/>
+          <w:szCs w:val="24"/>
+        </w:rPr>
+        <w:t>í</w:t>
+      </w:r>
+      <w:r>
+        <w:rPr>
+          <w:sz w:val="24"/>
+          <w:szCs w:val="24"/>
+        </w:rPr>
+        <w:t>fic</w:t>
+      </w:r>
+      <w:r>
+        <w:rPr>
+          <w:sz w:val="24"/>
+          <w:szCs w:val="24"/>
+        </w:rPr>
+        <w:t>a</w:t>
+      </w:r>
+      <w:r>
+        <w:rPr>
+          <w:sz w:val="24"/>
+          <w:szCs w:val="24"/>
+        </w:rPr>
+        <w:t xml:space="preserve">. Conversamos e </w:t>
+      </w:r>
+      <w:r>
+        <w:rPr>
+          <w:sz w:val="24"/>
+          <w:szCs w:val="24"/>
+        </w:rPr>
+        <w:t>optamos p</w:t>
+      </w:r>
+      <w:r>
+        <w:rPr>
+          <w:sz w:val="24"/>
+          <w:szCs w:val="24"/>
+        </w:rPr>
+        <w:t>ela</w:t>
+      </w:r>
+      <w:r>
+        <w:rPr>
+          <w:sz w:val="24"/>
+          <w:szCs w:val="24"/>
+        </w:rPr>
+        <w:t xml:space="preserve"> seguinte divisão: A Leticia </w:t>
+      </w:r>
+      <w:r>
+        <w:rPr>
+          <w:sz w:val="24"/>
+          <w:szCs w:val="24"/>
+        </w:rPr>
+        <w:t>fi</w:t>
+      </w:r>
+      <w:r>
+        <w:rPr>
+          <w:sz w:val="24"/>
+          <w:szCs w:val="24"/>
+        </w:rPr>
+        <w:t>cará responsável por finalizar</w:t>
+      </w:r>
+      <w:r>
+        <w:rPr>
+          <w:sz w:val="24"/>
+          <w:szCs w:val="24"/>
+        </w:rPr>
+        <w:t xml:space="preserve"> um modelo visual do </w:t>
+      </w:r>
+      <w:r>
+        <w:rPr>
+          <w:sz w:val="24"/>
+          <w:szCs w:val="24"/>
+        </w:rPr>
+        <w:t>aplicativo;</w:t>
+      </w:r>
+      <w:r>
         <w:t xml:space="preserve"> </w:t>
       </w:r>
-    </w:p>
-    <w:p>
-      <w:pPr>
-        <w:rPr>
-          <w:sz w:val="24"/>
-          <w:szCs w:val="24"/>
-        </w:rPr>
-      </w:pPr>
-      <w:r>
-        <w:rPr>
-          <w:sz w:val="24"/>
-          <w:szCs w:val="24"/>
-        </w:rPr>
-        <w:t>Decidimos que, com base nos artigos usados, estudar melhor suas estruturas seria importante para viabilizar o nosso projeto.</w:t>
-      </w:r>
-    </w:p>
-    <w:p>
-      <w:pPr>
-        <w:rPr>
-          <w:sz w:val="24"/>
-          <w:szCs w:val="24"/>
-        </w:rPr>
-      </w:pPr>
-    </w:p>
-    <w:p>
-      <w:pPr>
-        <w:rPr>
-          <w:rStyle w:val="Forte"/>
-        </w:rPr>
-      </w:pPr>
-      <w:r>
-        <w:rPr>
-          <w:rStyle w:val="Forte"/>
-        </w:rPr>
-        <w:t xml:space="preserve">Próximos passos: </w:t>
-      </w:r>
-    </w:p>
-    <w:p>
-      <w:pPr>
-        <w:rPr>
-          <w:sz w:val="24"/>
-          <w:szCs w:val="24"/>
-        </w:rPr>
-      </w:pPr>
-      <w:r>
-        <w:rPr>
-          <w:sz w:val="24"/>
-          <w:szCs w:val="24"/>
-        </w:rPr>
-        <w:t>Nas próximas aulas, apresentar determinadas ideias ao professor orientador para, assim, prosseguir na articulação do nosso TCC.</w:t>
-      </w:r>
-    </w:p>
-    <w:p>
-      <w:pPr>
-        <w:rPr>
-          <w:sz w:val="24"/>
-          <w:szCs w:val="24"/>
-        </w:rPr>
-      </w:pPr>
+      <w:r>
+        <w:rPr>
+          <w:sz w:val="24"/>
+          <w:szCs w:val="24"/>
+        </w:rPr>
+        <w:t>Laís e Thiago irão focar em estudar e se aprofundar em React (React é uma biblioteca JavaScript utilizada para criar interfaces de sites e aplicações web interativas)</w:t>
+      </w:r>
+      <w:r>
+        <w:rPr>
+          <w:sz w:val="24"/>
+          <w:szCs w:val="24"/>
+        </w:rPr>
+        <w:t>;</w:t>
+      </w:r>
+      <w:r>
+        <w:rPr>
+          <w:sz w:val="24"/>
+          <w:szCs w:val="24"/>
+        </w:rPr>
+        <w:t xml:space="preserve"> enquanto Rebeca </w:t>
+      </w:r>
+      <w:r>
+        <w:rPr>
+          <w:sz w:val="24"/>
+          <w:szCs w:val="24"/>
+        </w:rPr>
+        <w:t>dará continuidade</w:t>
+      </w:r>
+      <w:r>
+        <w:rPr>
+          <w:sz w:val="24"/>
+          <w:szCs w:val="24"/>
+        </w:rPr>
+        <w:t xml:space="preserve"> </w:t>
+      </w:r>
+      <w:r>
+        <w:rPr>
+          <w:sz w:val="24"/>
+          <w:szCs w:val="24"/>
+        </w:rPr>
+        <w:t>à</w:t>
+      </w:r>
+      <w:r>
+        <w:rPr>
+          <w:sz w:val="24"/>
+          <w:szCs w:val="24"/>
+        </w:rPr>
+        <w:t xml:space="preserve"> pesquisa de artigos</w:t>
+      </w:r>
+      <w:r>
+        <w:rPr>
+          <w:sz w:val="24"/>
+          <w:szCs w:val="24"/>
+        </w:rPr>
+        <w:t xml:space="preserve">, </w:t>
+      </w:r>
+      <w:r>
+        <w:rPr>
+          <w:sz w:val="24"/>
+          <w:szCs w:val="24"/>
+        </w:rPr>
+        <w:t xml:space="preserve">agora </w:t>
+      </w:r>
+      <w:r>
+        <w:rPr>
+          <w:sz w:val="24"/>
+          <w:szCs w:val="24"/>
+        </w:rPr>
+        <w:t>com foco</w:t>
+      </w:r>
+      <w:r>
+        <w:rPr>
+          <w:sz w:val="24"/>
+          <w:szCs w:val="24"/>
+        </w:rPr>
+        <w:t xml:space="preserve"> em identificação de plantas</w:t>
+      </w:r>
+      <w:r>
+        <w:rPr>
+          <w:sz w:val="24"/>
+          <w:szCs w:val="24"/>
+        </w:rPr>
+        <w:t xml:space="preserve"> por meio de inteligência artificial</w:t>
+      </w:r>
+      <w:r>
+        <w:rPr>
+          <w:sz w:val="24"/>
+          <w:szCs w:val="24"/>
+        </w:rPr>
+        <w:t>.</w:t>
+      </w:r>
+      <w:r>
+        <w:rPr>
+          <w:sz w:val="24"/>
+          <w:szCs w:val="24"/>
+        </w:rPr>
+        <w:t xml:space="preserve">     </w:t>
+      </w:r>
+      <w:r>
+        <w:rPr>
+          <w:sz w:val="24"/>
+          <w:szCs w:val="24"/>
+        </w:rPr>
+        <w:t xml:space="preserve">  </w:t>
+      </w:r>
     </w:p>
     <w:p>
       <w:pPr>
@@ -752,71 +983,72 @@
         <w:rPr>
           <w:b/>
           <w:bCs/>
-          <w:sz w:val="24"/>
-          <w:szCs w:val="24"/>
-        </w:rPr>
-      </w:pPr>
-      <w:r>
-        <w:rPr>
-          <w:b/>
-          <w:bCs/>
-          <w:sz w:val="24"/>
-          <w:szCs w:val="24"/>
-        </w:rPr>
-        <w:t xml:space="preserve">DATA: </w:t>
-      </w:r>
-      <w:r>
-        <w:rPr>
-          <w:b/>
-          <w:bCs/>
-          <w:sz w:val="24"/>
-          <w:szCs w:val="24"/>
-        </w:rPr>
-        <w:t>05</w:t>
-      </w:r>
-      <w:r>
-        <w:rPr>
-          <w:b/>
-          <w:bCs/>
-          <w:sz w:val="24"/>
-          <w:szCs w:val="24"/>
-        </w:rPr>
-        <w:t>/0</w:t>
-      </w:r>
-      <w:r>
-        <w:rPr>
-          <w:b/>
-          <w:bCs/>
-          <w:sz w:val="24"/>
-          <w:szCs w:val="24"/>
-        </w:rPr>
-        <w:t>3</w:t>
-      </w:r>
-      <w:r>
-        <w:rPr>
-          <w:b/>
-          <w:bCs/>
-          <w:sz w:val="24"/>
-          <w:szCs w:val="24"/>
-        </w:rPr>
-        <w:t>/2026</w:t>
-      </w:r>
-    </w:p>
-    <w:p>
-      <w:pPr>
-        <w:rPr>
-          <w:sz w:val="24"/>
-          <w:szCs w:val="24"/>
-        </w:rPr>
-      </w:pPr>
-    </w:p>
-    <w:p>
-      <w:pPr>
-        <w:rPr>
-          <w:sz w:val="24"/>
-          <w:szCs w:val="24"/>
-        </w:rPr>
-      </w:pPr>
+        </w:rPr>
+      </w:pPr>
+      <w:r>
+        <w:rPr>
+          <w:rStyle w:val="Forte"/>
+        </w:rPr>
+        <w:t>Decisões tomadas:</w:t>
+      </w:r>
+      <w:r>
+        <w:rPr>
+          <w:sz w:val="24"/>
+          <w:szCs w:val="24"/>
+        </w:rPr>
+        <w:t xml:space="preserve"> </w:t>
+      </w:r>
+    </w:p>
+    <w:p>
+      <w:pPr>
+        <w:rPr>
+          <w:sz w:val="24"/>
+          <w:szCs w:val="24"/>
+        </w:rPr>
+      </w:pPr>
+      <w:r>
+        <w:rPr>
+          <w:sz w:val="24"/>
+          <w:szCs w:val="24"/>
+        </w:rPr>
+        <w:t>Decidimos dividir as tarefas entre os integrantes do grupo para agilizar a organização e o andamento do projeto.</w:t>
+      </w:r>
+    </w:p>
+    <w:p>
+      <w:pPr>
+        <w:rPr>
+          <w:sz w:val="24"/>
+          <w:szCs w:val="24"/>
+        </w:rPr>
+      </w:pPr>
+    </w:p>
+    <w:p>
+      <w:pPr>
+        <w:rPr>
+          <w:rStyle w:val="Forte"/>
+        </w:rPr>
+      </w:pPr>
+      <w:r>
+        <w:rPr>
+          <w:rStyle w:val="Forte"/>
+        </w:rPr>
+        <w:t xml:space="preserve">Próximos passos: </w:t>
+      </w:r>
+    </w:p>
+    <w:p>
+      <w:pPr>
+        <w:rPr>
+          <w:sz w:val="24"/>
+          <w:szCs w:val="24"/>
+        </w:rPr>
+      </w:pPr>
+      <w:r>
+        <w:rPr>
+          <w:sz w:val="24"/>
+          <w:szCs w:val="24"/>
+        </w:rPr>
+        <w:t xml:space="preserve">Cada integrante realizar a tarefa designada, para que possamos depois discutir o </w:t>
+      </w:r>
       <w:bookmarkStart w:id="0" w:name="_GoBack"/>
       <w:bookmarkEnd w:id="0"/>
       <w:r>
@@ -824,7 +1056,14 @@
           <w:sz w:val="24"/>
           <w:szCs w:val="24"/>
         </w:rPr>
-        <w:tab/>
+        <w:t>que fazer adiante</w:t>
+      </w:r>
+      <w:r>
+        <w:rPr>
+          <w:sz w:val="24"/>
+          <w:szCs w:val="24"/>
+        </w:rPr>
+        <w:t>.</w:t>
       </w:r>
     </w:p>
     <w:sectPr>

</xml_diff>

<commit_message>
Atualizações do Diário de Bordo
</commit_message>
<xml_diff>
--- a/Diário de bordo/Diário De Bordo (Oficial).docx
+++ b/Diário de bordo/Diário De Bordo (Oficial).docx
@@ -18,6 +18,14 @@
           <w:sz w:val="28"/>
           <w:szCs w:val="28"/>
         </w:rPr>
+        <w:t xml:space="preserve">CENTRO PAULO SOPUZA </w:t>
+      </w:r>
+      <w:r>
+        <w:rPr>
+          <w:b/>
+          <w:sz w:val="28"/>
+          <w:szCs w:val="28"/>
+        </w:rPr>
         <w:t>ETEC PROFESSOR CAMARGO ARANHA</w:t>
       </w:r>
     </w:p>
@@ -37,8 +45,18 @@
           <w:sz w:val="28"/>
           <w:szCs w:val="28"/>
         </w:rPr>
-        <w:t>Desenvolvimento de Sistemas</w:t>
-      </w:r>
+        <w:t>D</w:t>
+      </w:r>
+      <w:r>
+        <w:rPr>
+          <w:b/>
+          <w:sz w:val="28"/>
+          <w:szCs w:val="28"/>
+        </w:rPr>
+        <w:t>ESENVOLVIMENTO DE SISTEMAS</w:t>
+      </w:r>
+      <w:bookmarkStart w:id="0" w:name="_GoBack"/>
+      <w:bookmarkEnd w:id="0"/>
     </w:p>
     <w:p>
       <w:pPr>
@@ -2591,8 +2609,6 @@
           <w:szCs w:val="24"/>
         </w:rPr>
       </w:pPr>
-      <w:bookmarkStart w:id="0" w:name="_GoBack"/>
-      <w:bookmarkEnd w:id="0"/>
     </w:p>
     <w:p>
       <w:pPr>
@@ -3777,7 +3793,7 @@
 </file>
 
 <file path=customXml/itemProps1.xml><?xml version="1.0" encoding="utf-8"?>
-<ds:datastoreItem xmlns:ds="http://schemas.openxmlformats.org/officeDocument/2006/customXml" ds:itemID="{CA230179-A795-4AA9-A094-05727523E780}">
+<ds:datastoreItem xmlns:ds="http://schemas.openxmlformats.org/officeDocument/2006/customXml" ds:itemID="{D2560AA8-A2C4-4AB6-B2FE-28F328E8788B}">
   <ds:schemaRefs>
     <ds:schemaRef ds:uri="http://schemas.openxmlformats.org/officeDocument/2006/bibliography"/>
   </ds:schemaRefs>

</xml_diff>